<commit_message>
CV: fit on two pages and link the Parcel Express project
- Tighten spacing/indents (text unchanged, 12pt kept) so the CV is two pages
- Start the Aloo role on page 2 to avoid a split job entry
- Add https://dev.parcelexpress.om/ as the Parcel Express project link
</commit_message>
<xml_diff>
--- a/public/cvs/BoulaNessimResume.docx
+++ b/public/cvs/BoulaNessimResume.docx
@@ -79,23 +79,23 @@
         <w:jc w:val="center"/>
         <w:rPr>
           <w:color w:val="000000"/>
-          <w:sz w:val="23"/>
-          <w:szCs w:val="23"/>
+          <w:sz w:val="24"/>
+          <w:szCs w:val="24"/>
         </w:rPr>
       </w:pPr>
       <w:r>
         <w:rPr>
           <w:color w:val="0563C1"/>
-          <w:sz w:val="23"/>
-          <w:szCs w:val="23"/>
+          <w:sz w:val="24"/>
+          <w:szCs w:val="24"/>
         </w:rPr>
         <w:t>6th of October City, Giza, Egypt</w:t>
       </w:r>
       <w:r>
         <w:rPr>
           <w:color w:val="0563C1"/>
-          <w:sz w:val="23"/>
-          <w:szCs w:val="23"/>
+          <w:sz w:val="24"/>
+          <w:szCs w:val="24"/>
         </w:rPr>
         <w:t>|</w:t>
       </w:r>
@@ -103,8 +103,8 @@
         <w:r>
           <w:rPr>
             <w:color w:val="5B9BD5"/>
-            <w:sz w:val="23"/>
-            <w:szCs w:val="23"/>
+            <w:sz w:val="24"/>
+            <w:szCs w:val="24"/>
           </w:rPr>
           <w:t>+</w:t>
         </w:r>
@@ -113,8 +113,8 @@
         <w:r>
           <w:rPr>
             <w:color w:val="0563C1"/>
-            <w:sz w:val="23"/>
-            <w:szCs w:val="23"/>
+            <w:sz w:val="24"/>
+            <w:szCs w:val="24"/>
           </w:rPr>
           <w:t>201126785910</w:t>
         </w:r>
@@ -122,8 +122,8 @@
       <w:r>
         <w:rPr>
           <w:color w:val="000000"/>
-          <w:sz w:val="23"/>
-          <w:szCs w:val="23"/>
+          <w:sz w:val="24"/>
+          <w:szCs w:val="24"/>
         </w:rPr>
         <w:t>|</w:t>
       </w:r>
@@ -131,8 +131,8 @@
         <w:r>
           <w:rPr>
             <w:color w:val="0563C1"/>
-            <w:sz w:val="23"/>
-            <w:szCs w:val="23"/>
+            <w:sz w:val="24"/>
+            <w:szCs w:val="24"/>
           </w:rPr>
           <w:t>boula.n.soliman@gmail.com</w:t>
         </w:r>
@@ -140,8 +140,8 @@
       <w:r>
         <w:rPr>
           <w:color w:val="000000"/>
-          <w:sz w:val="23"/>
-          <w:szCs w:val="23"/>
+          <w:sz w:val="24"/>
+          <w:szCs w:val="24"/>
         </w:rPr>
         <w:t>|</w:t>
       </w:r>
@@ -149,8 +149,8 @@
         <w:r>
           <w:rPr>
             <w:color w:val="0563C1"/>
-            <w:sz w:val="23"/>
-            <w:szCs w:val="23"/>
+            <w:sz w:val="24"/>
+            <w:szCs w:val="24"/>
           </w:rPr>
           <w:t>Github</w:t>
         </w:r>
@@ -158,8 +158,8 @@
       <w:r>
         <w:rPr>
           <w:color w:val="000000"/>
-          <w:sz w:val="23"/>
-          <w:szCs w:val="23"/>
+          <w:sz w:val="24"/>
+          <w:szCs w:val="24"/>
         </w:rPr>
         <w:t>|</w:t>
       </w:r>
@@ -167,8 +167,8 @@
         <w:r>
           <w:rPr>
             <w:color w:val="0563C1"/>
-            <w:sz w:val="23"/>
-            <w:szCs w:val="23"/>
+            <w:sz w:val="24"/>
+            <w:szCs w:val="24"/>
           </w:rPr>
           <w:t>Linkedin</w:t>
         </w:r>
@@ -200,8 +200,8 @@
       <w:r>
         <w:rPr>
           <w:b/>
-          <w:sz w:val="23"/>
-          <w:szCs w:val="23"/>
+          <w:sz w:val="24"/>
+          <w:szCs w:val="24"/>
         </w:rPr>
         <w:tab/>
         <w:t xml:space="preserve">         </w:t>
@@ -210,7 +210,7 @@
     <w:p>
       <w:pPr>
         <w:pStyle w:val="Heading1"/>
-        <w:ind w:left="720"/>
+        <w:ind w:left="540"/>
         <w:rPr>
           <w:b/>
         </w:rPr>
@@ -221,7 +221,7 @@
           <w:sz w:val="24"/>
           <w:szCs w:val="24"/>
         </w:rPr>
-        <w:t xml:space="preserve">Full Stack Developer with strong expertise in </w:t>
+        <w:t xml:space="preserve">Full Stack Laravel Developer with 4+ years of experience building </w:t>
       </w:r>
       <w:r>
         <w:rPr>
@@ -230,7 +230,7 @@
           <w:sz w:val="24"/>
           <w:szCs w:val="24"/>
         </w:rPr>
-        <w:t>Laravel, React, Next.js, and React Native</w:t>
+        <w:t xml:space="preserve">scalable web and mobile platforms, APIs and third-party integrations</w:t>
       </w:r>
       <w:r>
         <w:rPr>
@@ -238,7 +238,7 @@
           <w:sz w:val="24"/>
           <w:szCs w:val="24"/>
         </w:rPr>
-        <w:t xml:space="preserve">, delivering </w:t>
+        <w:t xml:space="preserve">, from multi-tenant logistics systems to internal tooling that generates dashboards and CRUD modules automatically. Strong in </w:t>
       </w:r>
       <w:r>
         <w:rPr>
@@ -247,7 +247,7 @@
           <w:sz w:val="24"/>
           <w:szCs w:val="24"/>
         </w:rPr>
-        <w:t>scalable and user-focused web &amp; mobile solutions</w:t>
+        <w:t xml:space="preserve">Laravel, React and React Native</w:t>
       </w:r>
       <w:r>
         <w:rPr>
@@ -255,7 +255,7 @@
           <w:sz w:val="24"/>
           <w:szCs w:val="24"/>
         </w:rPr>
-        <w:t>. Proven ability to build APIs, dashboards, and full-featured platforms that drive business growth. Seeking to contribute to a dynamic team that values innovation and technical excellence.</w:t>
+        <w:t xml:space="preserve">, with a focus on secure, maintainable backends that other systems can integrate with.</w:t>
       </w:r>
     </w:p>
     <w:p>
@@ -278,8 +278,8 @@
     </w:p>
     <w:p>
       <w:pPr>
-        <w:spacing w:before="280" w:after="280" w:line="240" w:lineRule="auto"/>
-        <w:ind w:left="720"/>
+        <w:spacing w:before="140" w:after="80" w:line="240" w:lineRule="auto"/>
+        <w:ind w:left="540"/>
         <w:rPr>
           <w:rFonts w:ascii="Times New Roman" w:eastAsia="Times New Roman" w:hAnsi="Times New Roman" w:cs="Times New Roman"/>
           <w:sz w:val="24"/>
@@ -302,22 +302,22 @@
           <w:ilvl w:val="0"/>
           <w:numId w:val="8"/>
         </w:numPr>
-        <w:spacing w:before="280" w:after="280" w:line="240" w:lineRule="auto"/>
-        <w:ind w:left="1440"/>
-      </w:pPr>
-      <w:r>
-        <w:rPr>
-          <w:rFonts w:ascii="Times New Roman" w:eastAsia="Times New Roman" w:hAnsi="Times New Roman" w:cs="Times New Roman"/>
-          <w:sz w:val="24"/>
-          <w:szCs w:val="24"/>
-        </w:rPr>
-        <w:t>PHP, JavaScript (ES6+), SQL, C, Java, OOP, SOLID Principles</w:t>
-      </w:r>
-    </w:p>
-    <w:p>
-      <w:pPr>
-        <w:spacing w:before="280" w:after="280" w:line="240" w:lineRule="auto"/>
-        <w:ind w:left="720"/>
+        <w:spacing w:before="140" w:after="80" w:line="240" w:lineRule="auto"/>
+        <w:ind w:left="1080"/>
+      </w:pPr>
+      <w:r>
+        <w:rPr>
+          <w:rFonts w:ascii="Times New Roman" w:eastAsia="Times New Roman" w:hAnsi="Times New Roman" w:cs="Times New Roman"/>
+          <w:sz w:val="24"/>
+          <w:szCs w:val="24"/>
+        </w:rPr>
+        <w:t xml:space="preserve">PHP, JavaScript (ES6+), SQL (MySQL, PostgreSQL), C, Java, OOP, SOLID Principles</w:t>
+      </w:r>
+    </w:p>
+    <w:p>
+      <w:pPr>
+        <w:spacing w:before="140" w:after="80" w:line="240" w:lineRule="auto"/>
+        <w:ind w:left="540"/>
         <w:rPr>
           <w:rFonts w:ascii="Times New Roman" w:eastAsia="Times New Roman" w:hAnsi="Times New Roman" w:cs="Times New Roman"/>
           <w:sz w:val="24"/>
@@ -340,22 +340,22 @@
           <w:ilvl w:val="0"/>
           <w:numId w:val="9"/>
         </w:numPr>
-        <w:spacing w:before="280" w:after="280" w:line="240" w:lineRule="auto"/>
-        <w:ind w:left="1440"/>
-      </w:pPr>
-      <w:r>
-        <w:rPr>
-          <w:rFonts w:ascii="Times New Roman" w:eastAsia="Times New Roman" w:hAnsi="Times New Roman" w:cs="Times New Roman"/>
-          <w:sz w:val="24"/>
-          <w:szCs w:val="24"/>
-        </w:rPr>
-        <w:t>Laravel (advanced), React.js (advanced), Next.js (mid-level), React Native (mid-level), Livewire (beginner), jQuery, AJAX</w:t>
-      </w:r>
-    </w:p>
-    <w:p>
-      <w:pPr>
-        <w:spacing w:before="280" w:after="280" w:line="240" w:lineRule="auto"/>
-        <w:ind w:left="720"/>
+        <w:spacing w:before="140" w:after="80" w:line="240" w:lineRule="auto"/>
+        <w:ind w:left="1080"/>
+      </w:pPr>
+      <w:r>
+        <w:rPr>
+          <w:rFonts w:ascii="Times New Roman" w:eastAsia="Times New Roman" w:hAnsi="Times New Roman" w:cs="Times New Roman"/>
+          <w:sz w:val="24"/>
+          <w:szCs w:val="24"/>
+        </w:rPr>
+        <w:t xml:space="preserve">Laravel (advanced), React.js (advanced), Next.js (mid-level), React Native (mid-level), jQuery, AJAX</w:t>
+      </w:r>
+    </w:p>
+    <w:p>
+      <w:pPr>
+        <w:spacing w:before="140" w:after="80" w:line="240" w:lineRule="auto"/>
+        <w:ind w:left="540"/>
         <w:rPr>
           <w:rFonts w:ascii="Times New Roman" w:eastAsia="Times New Roman" w:hAnsi="Times New Roman" w:cs="Times New Roman"/>
           <w:sz w:val="24"/>
@@ -378,22 +378,22 @@
           <w:ilvl w:val="0"/>
           <w:numId w:val="1"/>
         </w:numPr>
-        <w:spacing w:before="280" w:after="280" w:line="240" w:lineRule="auto"/>
-        <w:ind w:left="1440"/>
-      </w:pPr>
-      <w:r>
-        <w:rPr>
-          <w:rFonts w:ascii="Times New Roman" w:eastAsia="Times New Roman" w:hAnsi="Times New Roman" w:cs="Times New Roman"/>
-          <w:sz w:val="24"/>
-          <w:szCs w:val="24"/>
-        </w:rPr>
-        <w:t>HTML5, CSS3, Bootstrap, Tailwind, WordPress (beginner)</w:t>
-      </w:r>
-    </w:p>
-    <w:p>
-      <w:pPr>
-        <w:spacing w:before="280" w:after="280" w:line="240" w:lineRule="auto"/>
-        <w:ind w:left="720"/>
+        <w:spacing w:before="140" w:after="80" w:line="240" w:lineRule="auto"/>
+        <w:ind w:left="1080"/>
+      </w:pPr>
+      <w:r>
+        <w:rPr>
+          <w:rFonts w:ascii="Times New Roman" w:eastAsia="Times New Roman" w:hAnsi="Times New Roman" w:cs="Times New Roman"/>
+          <w:sz w:val="24"/>
+          <w:szCs w:val="24"/>
+        </w:rPr>
+        <w:t xml:space="preserve">HTML5, CSS3, Bootstrap, Tailwind</w:t>
+      </w:r>
+    </w:p>
+    <w:p>
+      <w:pPr>
+        <w:spacing w:before="140" w:after="80" w:line="240" w:lineRule="auto"/>
+        <w:ind w:left="540"/>
         <w:rPr>
           <w:rFonts w:ascii="Times New Roman" w:eastAsia="Times New Roman" w:hAnsi="Times New Roman" w:cs="Times New Roman"/>
           <w:sz w:val="24"/>
@@ -416,22 +416,22 @@
           <w:ilvl w:val="0"/>
           <w:numId w:val="2"/>
         </w:numPr>
-        <w:spacing w:before="280" w:after="280" w:line="240" w:lineRule="auto"/>
-        <w:ind w:left="1440"/>
-      </w:pPr>
-      <w:r>
-        <w:rPr>
-          <w:rFonts w:ascii="Times New Roman" w:eastAsia="Times New Roman" w:hAnsi="Times New Roman" w:cs="Times New Roman"/>
-          <w:sz w:val="24"/>
-          <w:szCs w:val="24"/>
-        </w:rPr>
-        <w:t>REST APIs, Third-Party Integrations (Payment Gateways, SMS, Google Maps, Email Systems), WebSockets</w:t>
-      </w:r>
-    </w:p>
-    <w:p>
-      <w:pPr>
-        <w:spacing w:before="280" w:after="280" w:line="240" w:lineRule="auto"/>
-        <w:ind w:left="720"/>
+        <w:spacing w:before="140" w:after="80" w:line="240" w:lineRule="auto"/>
+        <w:ind w:left="1080"/>
+      </w:pPr>
+      <w:r>
+        <w:rPr>
+          <w:rFonts w:ascii="Times New Roman" w:eastAsia="Times New Roman" w:hAnsi="Times New Roman" w:cs="Times New Roman"/>
+          <w:sz w:val="24"/>
+          <w:szCs w:val="24"/>
+        </w:rPr>
+        <w:t xml:space="preserve">REST APIs, Third-Party Integrations (Payment Gateways, SMS, Google Maps, Email Systems), WebSockets, Multi-tenant Architecture, Queued Jobs</w:t>
+      </w:r>
+    </w:p>
+    <w:p>
+      <w:pPr>
+        <w:spacing w:before="140" w:after="80" w:line="240" w:lineRule="auto"/>
+        <w:ind w:left="540"/>
         <w:rPr>
           <w:rFonts w:ascii="Times New Roman" w:eastAsia="Times New Roman" w:hAnsi="Times New Roman" w:cs="Times New Roman"/>
           <w:sz w:val="24"/>
@@ -454,16 +454,16 @@
           <w:ilvl w:val="0"/>
           <w:numId w:val="3"/>
         </w:numPr>
-        <w:spacing w:before="280" w:after="280" w:line="240" w:lineRule="auto"/>
-        <w:ind w:left="1440"/>
-      </w:pPr>
-      <w:r>
-        <w:rPr>
-          <w:rFonts w:ascii="Times New Roman" w:eastAsia="Times New Roman" w:hAnsi="Times New Roman" w:cs="Times New Roman"/>
-          <w:sz w:val="24"/>
-          <w:szCs w:val="24"/>
-        </w:rPr>
-        <w:t>Git (Version Control), Postman, Apache, Server Management, Project Management</w:t>
+        <w:spacing w:before="140" w:after="80" w:line="240" w:lineRule="auto"/>
+        <w:ind w:left="1080"/>
+      </w:pPr>
+      <w:r>
+        <w:rPr>
+          <w:rFonts w:ascii="Times New Roman" w:eastAsia="Times New Roman" w:hAnsi="Times New Roman" w:cs="Times New Roman"/>
+          <w:sz w:val="24"/>
+          <w:szCs w:val="24"/>
+        </w:rPr>
+        <w:t xml:space="preserve">Git (Version Control), Postman, Apache, Server Management</w:t>
       </w:r>
     </w:p>
     <w:p>
@@ -487,8 +487,8 @@
     </w:p>
     <w:p>
       <w:pPr>
-        <w:spacing w:before="280" w:after="280" w:line="240" w:lineRule="auto"/>
-        <w:ind w:left="720"/>
+        <w:spacing w:before="140" w:after="80" w:line="240" w:lineRule="auto"/>
+        <w:ind w:left="540"/>
         <w:rPr>
           <w:rFonts w:ascii="Times New Roman" w:eastAsia="Times New Roman" w:hAnsi="Times New Roman" w:cs="Times New Roman"/>
           <w:sz w:val="24"/>
@@ -592,7 +592,7 @@
           <w:numId w:val="4"/>
         </w:numPr>
         <w:spacing w:after="0" w:line="240" w:lineRule="auto"/>
-        <w:ind w:left="1440"/>
+        <w:ind w:left="1080"/>
       </w:pPr>
       <w:r>
         <w:rPr>
@@ -610,7 +610,7 @@
           <w:numId w:val="4"/>
         </w:numPr>
         <w:spacing w:after="0" w:line="240" w:lineRule="auto"/>
-        <w:ind w:left="1440"/>
+        <w:ind w:left="1080"/>
       </w:pPr>
       <w:r>
         <w:rPr>
@@ -635,126 +635,6 @@
           <w:szCs w:val="24"/>
         </w:rPr>
         <w:t>error handling protocols.</w:t>
-      </w:r>
-    </w:p>
-    <w:p>
-      <w:pPr>
-        <w:spacing w:after="0" w:line="240" w:lineRule="auto"/>
-        <w:ind w:left="1080"/>
-      </w:pPr>
-    </w:p>
-    <w:p>
-      <w:pPr>
-        <w:spacing w:before="280" w:after="280" w:line="240" w:lineRule="auto"/>
-        <w:ind w:left="720"/>
-        <w:rPr>
-          <w:rFonts w:ascii="Times New Roman" w:eastAsia="Times New Roman" w:hAnsi="Times New Roman" w:cs="Times New Roman"/>
-          <w:sz w:val="24"/>
-          <w:szCs w:val="24"/>
-        </w:rPr>
-      </w:pPr>
-      <w:r>
-        <w:rPr>
-          <w:rFonts w:ascii="Times New Roman" w:eastAsia="Times New Roman" w:hAnsi="Times New Roman" w:cs="Times New Roman"/>
-          <w:b/>
-          <w:sz w:val="24"/>
-          <w:szCs w:val="24"/>
-        </w:rPr>
-        <w:t>Full Stack Laravel Developer | Aloo Company (Remote – KSA)</w:t>
-      </w:r>
-      <w:r>
-        <w:rPr>
-          <w:rFonts w:ascii="Times New Roman" w:eastAsia="Times New Roman" w:hAnsi="Times New Roman" w:cs="Times New Roman"/>
-          <w:sz w:val="24"/>
-          <w:szCs w:val="24"/>
-        </w:rPr>
-        <w:br/>
-      </w:r>
-      <w:r>
-        <w:rPr>
-          <w:rFonts w:ascii="Times New Roman" w:eastAsia="Times New Roman" w:hAnsi="Times New Roman" w:cs="Times New Roman"/>
-          <w:i/>
-          <w:sz w:val="24"/>
-          <w:szCs w:val="24"/>
-        </w:rPr>
-        <w:t xml:space="preserve">Oct 2024 – </w:t>
-      </w:r>
-      <w:r>
-        <w:rPr>
-          <w:rFonts w:ascii="Times New Roman" w:eastAsia="Times New Roman" w:hAnsi="Times New Roman" w:cs="Times New Roman"/>
-          <w:i/>
-          <w:sz w:val="24"/>
-          <w:szCs w:val="24"/>
-        </w:rPr>
-        <w:t>Nov 2023</w:t>
-      </w:r>
-    </w:p>
-    <w:p>
-      <w:pPr>
-        <w:numPr>
-          <w:ilvl w:val="0"/>
-          <w:numId w:val="4"/>
-        </w:numPr>
-        <w:spacing w:before="280" w:after="0" w:line="240" w:lineRule="auto"/>
-        <w:ind w:left="1440"/>
-      </w:pPr>
-      <w:r>
-        <w:rPr>
-          <w:rFonts w:ascii="Times New Roman" w:eastAsia="Times New Roman" w:hAnsi="Times New Roman" w:cs="Times New Roman"/>
-          <w:sz w:val="24"/>
-          <w:szCs w:val="24"/>
-        </w:rPr>
-        <w:t xml:space="preserve">Designed and implemented </w:t>
-      </w:r>
-      <w:r>
-        <w:rPr>
-          <w:rFonts w:ascii="Times New Roman" w:eastAsia="Times New Roman" w:hAnsi="Times New Roman" w:cs="Times New Roman"/>
-          <w:b/>
-          <w:sz w:val="24"/>
-          <w:szCs w:val="24"/>
-        </w:rPr>
-        <w:t>REST APIs</w:t>
-      </w:r>
-      <w:r>
-        <w:rPr>
-          <w:rFonts w:ascii="Times New Roman" w:eastAsia="Times New Roman" w:hAnsi="Times New Roman" w:cs="Times New Roman"/>
-          <w:sz w:val="24"/>
-          <w:szCs w:val="24"/>
-        </w:rPr>
-        <w:t xml:space="preserve"> for frontend (React &amp; </w:t>
-      </w:r>
-      <w:r>
-        <w:rPr>
-          <w:rFonts w:ascii="Times New Roman" w:eastAsia="Times New Roman" w:hAnsi="Times New Roman" w:cs="Times New Roman"/>
-          <w:sz w:val="24"/>
-          <w:szCs w:val="24"/>
-        </w:rPr>
-        <w:t>Flutter</w:t>
-      </w:r>
-      <w:r>
-        <w:rPr>
-          <w:rFonts w:ascii="Times New Roman" w:eastAsia="Times New Roman" w:hAnsi="Times New Roman" w:cs="Times New Roman"/>
-          <w:sz w:val="24"/>
-          <w:szCs w:val="24"/>
-        </w:rPr>
-        <w:t xml:space="preserve">), improving response efficiency by </w:t>
-      </w:r>
-      <w:r>
-        <w:rPr>
-          <w:rFonts w:ascii="Times New Roman" w:eastAsia="Times New Roman" w:hAnsi="Times New Roman" w:cs="Times New Roman"/>
-          <w:b/>
-          <w:sz w:val="24"/>
-          <w:szCs w:val="24"/>
-        </w:rPr>
-        <w:t>25%</w:t>
-      </w:r>
-      <w:r>
-        <w:rPr>
-          <w:rFonts w:ascii="Times New Roman" w:eastAsia="Times New Roman" w:hAnsi="Times New Roman" w:cs="Times New Roman"/>
-          <w:sz w:val="24"/>
-          <w:szCs w:val="24"/>
-        </w:rPr>
-        <w:t>.</w:t>
       </w:r>
     </w:p>
     <w:p>
@@ -764,50 +644,31 @@
           <w:numId w:val="4"/>
         </w:numPr>
         <w:spacing w:after="0" w:line="240" w:lineRule="auto"/>
-        <w:ind w:left="1440"/>
-      </w:pPr>
-      <w:r>
-        <w:rPr>
-          <w:rFonts w:ascii="Times New Roman" w:eastAsia="Times New Roman" w:hAnsi="Times New Roman" w:cs="Times New Roman"/>
-          <w:sz w:val="24"/>
-          <w:szCs w:val="24"/>
-        </w:rPr>
-        <w:lastRenderedPageBreak/>
-        <w:t xml:space="preserve">Integrated </w:t>
-      </w:r>
-      <w:r>
-        <w:rPr>
-          <w:rFonts w:ascii="Times New Roman" w:eastAsia="Times New Roman" w:hAnsi="Times New Roman" w:cs="Times New Roman"/>
-          <w:b/>
-          <w:sz w:val="24"/>
-          <w:szCs w:val="24"/>
-        </w:rPr>
-        <w:t>SMS &amp; payment gateways</w:t>
-      </w:r>
-      <w:r>
-        <w:rPr>
-          <w:rFonts w:ascii="Times New Roman" w:eastAsia="Times New Roman" w:hAnsi="Times New Roman" w:cs="Times New Roman"/>
-          <w:sz w:val="24"/>
-          <w:szCs w:val="24"/>
-        </w:rPr>
-        <w:t xml:space="preserve">, enabling </w:t>
-      </w:r>
-      <w:r>
-        <w:rPr>
-          <w:rFonts w:ascii="Times New Roman" w:eastAsia="Times New Roman" w:hAnsi="Times New Roman" w:cs="Times New Roman"/>
-          <w:b/>
-          <w:sz w:val="24"/>
-          <w:szCs w:val="24"/>
-        </w:rPr>
-        <w:t>100+ secure monthly transactions</w:t>
-      </w:r>
-      <w:r>
-        <w:rPr>
-          <w:rFonts w:ascii="Times New Roman" w:eastAsia="Times New Roman" w:hAnsi="Times New Roman" w:cs="Times New Roman"/>
-          <w:sz w:val="24"/>
-          <w:szCs w:val="24"/>
-        </w:rPr>
-        <w:t>.</w:t>
+        <w:ind w:left="1080"/>
+      </w:pPr>
+      <w:r>
+        <w:rPr>
+          <w:rFonts w:ascii="Times New Roman" w:eastAsia="Times New Roman" w:hAnsi="Times New Roman" w:cs="Times New Roman"/>
+          <w:sz w:val="24"/>
+          <w:szCs w:val="24"/>
+        </w:rPr>
+        <w:t xml:space="preserve">Built shipment workflows covering delivery-fee, COD and commission calculations, with consistent results across merchant, driver and partner flows.</w:t>
+      </w:r>
+      <w:r>
+        <w:rPr>
+          <w:rFonts w:ascii="Times New Roman" w:eastAsia="Times New Roman" w:hAnsi="Times New Roman" w:cs="Times New Roman"/>
+          <w:sz w:val="24"/>
+          <w:szCs w:val="24"/>
+        </w:rPr>
+        <w:t/>
+      </w:r>
+      <w:r>
+        <w:rPr>
+          <w:rFonts w:ascii="Times New Roman" w:eastAsia="Times New Roman" w:hAnsi="Times New Roman" w:cs="Times New Roman"/>
+          <w:sz w:val="24"/>
+          <w:szCs w:val="24"/>
+        </w:rPr>
+        <w:t/>
       </w:r>
     </w:p>
     <w:p>
@@ -816,8 +677,284 @@
           <w:ilvl w:val="0"/>
           <w:numId w:val="4"/>
         </w:numPr>
-        <w:spacing w:after="280" w:line="240" w:lineRule="auto"/>
-        <w:ind w:left="1440"/>
+        <w:spacing w:after="0" w:line="240" w:lineRule="auto"/>
+        <w:ind w:left="1080"/>
+      </w:pPr>
+      <w:r>
+        <w:rPr>
+          <w:rFonts w:ascii="Times New Roman" w:eastAsia="Times New Roman" w:hAnsi="Times New Roman" w:cs="Times New Roman"/>
+          <w:sz w:val="24"/>
+          <w:szCs w:val="24"/>
+        </w:rPr>
+        <w:t xml:space="preserve">Implemented partner-specific mappings and idempotent shipment creation, preventing duplicate shipments on retries and webhook re-deliveries.</w:t>
+      </w:r>
+      <w:r>
+        <w:rPr>
+          <w:rFonts w:ascii="Times New Roman" w:eastAsia="Times New Roman" w:hAnsi="Times New Roman" w:cs="Times New Roman"/>
+          <w:sz w:val="24"/>
+          <w:szCs w:val="24"/>
+        </w:rPr>
+        <w:t/>
+      </w:r>
+      <w:r>
+        <w:rPr>
+          <w:rFonts w:ascii="Times New Roman" w:eastAsia="Times New Roman" w:hAnsi="Times New Roman" w:cs="Times New Roman"/>
+          <w:sz w:val="24"/>
+          <w:szCs w:val="24"/>
+        </w:rPr>
+        <w:t/>
+      </w:r>
+    </w:p>
+    <w:p>
+      <w:pPr>
+        <w:numPr>
+          <w:ilvl w:val="0"/>
+          <w:numId w:val="4"/>
+        </w:numPr>
+        <w:spacing w:after="0" w:line="240" w:lineRule="auto"/>
+        <w:ind w:left="1080"/>
+      </w:pPr>
+      <w:r>
+        <w:rPr>
+          <w:rFonts w:ascii="Times New Roman" w:eastAsia="Times New Roman" w:hAnsi="Times New Roman" w:cs="Times New Roman"/>
+          <w:sz w:val="24"/>
+          <w:szCs w:val="24"/>
+        </w:rPr>
+        <w:t xml:space="preserve">Enforced workspace/merchant data isolation and role-based access across the APIs, and ran external integrations as queued jobs with retries, timeouts and failure handling.</w:t>
+      </w:r>
+      <w:r>
+        <w:rPr>
+          <w:rFonts w:ascii="Times New Roman" w:eastAsia="Times New Roman" w:hAnsi="Times New Roman" w:cs="Times New Roman"/>
+          <w:sz w:val="24"/>
+          <w:szCs w:val="24"/>
+        </w:rPr>
+        <w:t/>
+      </w:r>
+      <w:r>
+        <w:rPr>
+          <w:rFonts w:ascii="Times New Roman" w:eastAsia="Times New Roman" w:hAnsi="Times New Roman" w:cs="Times New Roman"/>
+          <w:sz w:val="24"/>
+          <w:szCs w:val="24"/>
+        </w:rPr>
+        <w:t/>
+      </w:r>
+    </w:p>
+    <w:p>
+      <w:pPr>
+        <w:numPr>
+          <w:ilvl w:val="0"/>
+          <w:numId w:val="4"/>
+        </w:numPr>
+        <w:spacing w:after="0" w:line="240" w:lineRule="auto"/>
+        <w:ind w:left="1080"/>
+      </w:pPr>
+      <w:r>
+        <w:rPr>
+          <w:rFonts w:ascii="Times New Roman" w:eastAsia="Times New Roman" w:hAnsi="Times New Roman" w:cs="Times New Roman"/>
+          <w:sz w:val="24"/>
+          <w:szCs w:val="24"/>
+        </w:rPr>
+        <w:t xml:space="preserve">Kept the platform compatible with both MySQL and PostgreSQL and standardised UTC storage with per-client timezone conversion.</w:t>
+      </w:r>
+      <w:r>
+        <w:rPr>
+          <w:rFonts w:ascii="Times New Roman" w:eastAsia="Times New Roman" w:hAnsi="Times New Roman" w:cs="Times New Roman"/>
+          <w:sz w:val="24"/>
+          <w:szCs w:val="24"/>
+        </w:rPr>
+        <w:t/>
+      </w:r>
+      <w:r>
+        <w:rPr>
+          <w:rFonts w:ascii="Times New Roman" w:eastAsia="Times New Roman" w:hAnsi="Times New Roman" w:cs="Times New Roman"/>
+          <w:sz w:val="24"/>
+          <w:szCs w:val="24"/>
+        </w:rPr>
+        <w:t/>
+      </w:r>
+    </w:p>
+    <w:p>
+      <w:pPr>
+        <w:spacing w:after="0" w:line="240" w:lineRule="auto"/>
+        <w:ind w:left="1080"/>
+      </w:pPr>
+    </w:p>
+    <w:p>
+      <w:pPr>
+        <w:pageBreakBefore/>
+        <w:spacing w:before="140" w:after="80" w:line="240" w:lineRule="auto"/>
+        <w:ind w:left="540"/>
+        <w:rPr>
+          <w:rFonts w:ascii="Times New Roman" w:eastAsia="Times New Roman" w:hAnsi="Times New Roman" w:cs="Times New Roman"/>
+          <w:sz w:val="24"/>
+          <w:szCs w:val="24"/>
+        </w:rPr>
+      </w:pPr>
+      <w:r>
+        <w:rPr>
+          <w:rFonts w:ascii="Times New Roman" w:eastAsia="Times New Roman" w:hAnsi="Times New Roman" w:cs="Times New Roman"/>
+          <w:b/>
+          <w:sz w:val="24"/>
+          <w:szCs w:val="24"/>
+        </w:rPr>
+        <w:t>Full Stack Laravel Developer | Aloo Company (Remote – KSA)</w:t>
+      </w:r>
+      <w:r>
+        <w:rPr>
+          <w:rFonts w:ascii="Times New Roman" w:eastAsia="Times New Roman" w:hAnsi="Times New Roman" w:cs="Times New Roman"/>
+          <w:sz w:val="24"/>
+          <w:szCs w:val="24"/>
+        </w:rPr>
+        <w:br/>
+      </w:r>
+      <w:r>
+        <w:rPr>
+          <w:rFonts w:ascii="Times New Roman" w:eastAsia="Times New Roman" w:hAnsi="Times New Roman" w:cs="Times New Roman"/>
+          <w:i/>
+          <w:sz w:val="24"/>
+          <w:szCs w:val="24"/>
+        </w:rPr>
+        <w:t xml:space="preserve">Oct 2024 – </w:t>
+      </w:r>
+      <w:r>
+        <w:rPr>
+          <w:rFonts w:ascii="Times New Roman" w:eastAsia="Times New Roman" w:hAnsi="Times New Roman" w:cs="Times New Roman"/>
+          <w:i/>
+          <w:sz w:val="24"/>
+          <w:szCs w:val="24"/>
+        </w:rPr>
+        <w:t>Nov 2025</w:t>
+      </w:r>
+    </w:p>
+    <w:p>
+      <w:pPr>
+        <w:numPr>
+          <w:ilvl w:val="0"/>
+          <w:numId w:val="4"/>
+        </w:numPr>
+        <w:spacing w:before="140" w:after="0" w:line="240" w:lineRule="auto"/>
+        <w:ind w:left="1080"/>
+      </w:pPr>
+      <w:r>
+        <w:rPr>
+          <w:rFonts w:ascii="Times New Roman" w:eastAsia="Times New Roman" w:hAnsi="Times New Roman" w:cs="Times New Roman"/>
+          <w:sz w:val="24"/>
+          <w:szCs w:val="24"/>
+        </w:rPr>
+        <w:t xml:space="preserve">Designed and implemented </w:t>
+      </w:r>
+      <w:r>
+        <w:rPr>
+          <w:rFonts w:ascii="Times New Roman" w:eastAsia="Times New Roman" w:hAnsi="Times New Roman" w:cs="Times New Roman"/>
+          <w:b/>
+          <w:sz w:val="24"/>
+          <w:szCs w:val="24"/>
+        </w:rPr>
+        <w:t>REST APIs</w:t>
+      </w:r>
+      <w:r>
+        <w:rPr>
+          <w:rFonts w:ascii="Times New Roman" w:eastAsia="Times New Roman" w:hAnsi="Times New Roman" w:cs="Times New Roman"/>
+          <w:sz w:val="24"/>
+          <w:szCs w:val="24"/>
+        </w:rPr>
+        <w:t xml:space="preserve"> for frontend (React &amp; </w:t>
+      </w:r>
+      <w:r>
+        <w:rPr>
+          <w:rFonts w:ascii="Times New Roman" w:eastAsia="Times New Roman" w:hAnsi="Times New Roman" w:cs="Times New Roman"/>
+          <w:sz w:val="24"/>
+          <w:szCs w:val="24"/>
+        </w:rPr>
+        <w:t>Flutter</w:t>
+      </w:r>
+      <w:r>
+        <w:rPr>
+          <w:rFonts w:ascii="Times New Roman" w:eastAsia="Times New Roman" w:hAnsi="Times New Roman" w:cs="Times New Roman"/>
+          <w:sz w:val="24"/>
+          <w:szCs w:val="24"/>
+        </w:rPr>
+        <w:t xml:space="preserve">), improving response efficiency by </w:t>
+      </w:r>
+      <w:r>
+        <w:rPr>
+          <w:rFonts w:ascii="Times New Roman" w:eastAsia="Times New Roman" w:hAnsi="Times New Roman" w:cs="Times New Roman"/>
+          <w:b/>
+          <w:sz w:val="24"/>
+          <w:szCs w:val="24"/>
+        </w:rPr>
+        <w:t>25%</w:t>
+      </w:r>
+      <w:r>
+        <w:rPr>
+          <w:rFonts w:ascii="Times New Roman" w:eastAsia="Times New Roman" w:hAnsi="Times New Roman" w:cs="Times New Roman"/>
+          <w:sz w:val="24"/>
+          <w:szCs w:val="24"/>
+        </w:rPr>
+        <w:t>.</w:t>
+      </w:r>
+    </w:p>
+    <w:p>
+      <w:pPr>
+        <w:numPr>
+          <w:ilvl w:val="0"/>
+          <w:numId w:val="4"/>
+        </w:numPr>
+        <w:spacing w:after="0" w:line="240" w:lineRule="auto"/>
+        <w:ind w:left="1080"/>
+      </w:pPr>
+      <w:r>
+        <w:rPr>
+          <w:rFonts w:ascii="Times New Roman" w:eastAsia="Times New Roman" w:hAnsi="Times New Roman" w:cs="Times New Roman"/>
+          <w:sz w:val="24"/>
+          <w:szCs w:val="24"/>
+        </w:rPr>
+        <w:lastRenderedPageBreak/>
+        <w:t xml:space="preserve">Integrated </w:t>
+      </w:r>
+      <w:r>
+        <w:rPr>
+          <w:rFonts w:ascii="Times New Roman" w:eastAsia="Times New Roman" w:hAnsi="Times New Roman" w:cs="Times New Roman"/>
+          <w:b/>
+          <w:sz w:val="24"/>
+          <w:szCs w:val="24"/>
+        </w:rPr>
+        <w:t>SMS &amp; payment gateways</w:t>
+      </w:r>
+      <w:r>
+        <w:rPr>
+          <w:rFonts w:ascii="Times New Roman" w:eastAsia="Times New Roman" w:hAnsi="Times New Roman" w:cs="Times New Roman"/>
+          <w:sz w:val="24"/>
+          <w:szCs w:val="24"/>
+        </w:rPr>
+        <w:t xml:space="preserve">, enabling </w:t>
+      </w:r>
+      <w:r>
+        <w:rPr>
+          <w:rFonts w:ascii="Times New Roman" w:eastAsia="Times New Roman" w:hAnsi="Times New Roman" w:cs="Times New Roman"/>
+          <w:b/>
+          <w:sz w:val="24"/>
+          <w:szCs w:val="24"/>
+        </w:rPr>
+        <w:t>secure online transactions</w:t>
+      </w:r>
+      <w:r>
+        <w:rPr>
+          <w:rFonts w:ascii="Times New Roman" w:eastAsia="Times New Roman" w:hAnsi="Times New Roman" w:cs="Times New Roman"/>
+          <w:sz w:val="24"/>
+          <w:szCs w:val="24"/>
+        </w:rPr>
+        <w:t>.</w:t>
+      </w:r>
+    </w:p>
+    <w:p>
+      <w:pPr>
+        <w:numPr>
+          <w:ilvl w:val="0"/>
+          <w:numId w:val="4"/>
+        </w:numPr>
+        <w:spacing w:after="80" w:line="240" w:lineRule="auto"/>
+        <w:ind w:left="1080"/>
       </w:pPr>
       <w:r>
         <w:rPr>
@@ -864,8 +1001,8 @@
     </w:p>
     <w:p>
       <w:pPr>
-        <w:spacing w:before="280" w:after="280" w:line="240" w:lineRule="auto"/>
-        <w:ind w:left="720"/>
+        <w:spacing w:before="140" w:after="80" w:line="240" w:lineRule="auto"/>
+        <w:ind w:left="540"/>
         <w:rPr>
           <w:rFonts w:ascii="Times New Roman" w:eastAsia="Times New Roman" w:hAnsi="Times New Roman" w:cs="Times New Roman"/>
           <w:sz w:val="24"/>
@@ -905,50 +1042,43 @@
           <w:ilvl w:val="0"/>
           <w:numId w:val="5"/>
         </w:numPr>
-        <w:spacing w:before="280" w:after="0" w:line="240" w:lineRule="auto"/>
-        <w:ind w:left="1440"/>
-      </w:pPr>
-      <w:r>
-        <w:rPr>
-          <w:rFonts w:ascii="Times New Roman" w:eastAsia="Times New Roman" w:hAnsi="Times New Roman" w:cs="Times New Roman"/>
-          <w:sz w:val="24"/>
-          <w:szCs w:val="24"/>
-        </w:rPr>
-        <w:t xml:space="preserve">Developed </w:t>
-      </w:r>
-      <w:r>
-        <w:rPr>
-          <w:rFonts w:ascii="Times New Roman" w:eastAsia="Times New Roman" w:hAnsi="Times New Roman" w:cs="Times New Roman"/>
-          <w:b/>
-          <w:sz w:val="24"/>
-          <w:szCs w:val="24"/>
-        </w:rPr>
-        <w:t>responsive websites &amp; mobile apps</w:t>
-      </w:r>
-      <w:r>
-        <w:rPr>
-          <w:rFonts w:ascii="Times New Roman" w:eastAsia="Times New Roman" w:hAnsi="Times New Roman" w:cs="Times New Roman"/>
-          <w:sz w:val="24"/>
-          <w:szCs w:val="24"/>
-        </w:rPr>
-        <w:t xml:space="preserve"> (React, React Native) serving </w:t>
-      </w:r>
-      <w:r>
-        <w:rPr>
-          <w:rFonts w:ascii="Times New Roman" w:eastAsia="Times New Roman" w:hAnsi="Times New Roman" w:cs="Times New Roman"/>
-          <w:b/>
-          <w:sz w:val="24"/>
-          <w:szCs w:val="24"/>
-        </w:rPr>
-        <w:t>5K+ monthly active users</w:t>
-      </w:r>
-      <w:r>
-        <w:rPr>
-          <w:rFonts w:ascii="Times New Roman" w:eastAsia="Times New Roman" w:hAnsi="Times New Roman" w:cs="Times New Roman"/>
-          <w:sz w:val="24"/>
-          <w:szCs w:val="24"/>
-        </w:rPr>
-        <w:t>.</w:t>
+        <w:spacing w:before="140" w:after="0" w:line="240" w:lineRule="auto"/>
+        <w:ind w:left="1080"/>
+        <w:rPr>
+          <w:rFonts w:ascii="Times New Roman" w:eastAsia="Times New Roman" w:hAnsi="Times New Roman" w:cs="Times New Roman"/>
+          <w:sz w:val="24"/>
+          <w:szCs w:val="24"/>
+        </w:rPr>
+      </w:pPr>
+      <w:r>
+        <w:rPr>
+          <w:rFonts w:ascii="Times New Roman" w:eastAsia="Times New Roman" w:hAnsi="Times New Roman" w:cs="Times New Roman"/>
+          <w:sz w:val="24"/>
+          <w:szCs w:val="24"/>
+        </w:rPr>
+        <w:t>Created an internal system (“Workspace”) that automatically generates new dashboard modules for the backend team — accelerating development speed and reducing setup time by over 60%.</w:t>
+      </w:r>
+    </w:p>
+    <w:p>
+      <w:pPr>
+        <w:numPr>
+          <w:ilvl w:val="1"/>
+          <w:numId w:val="10"/>
+        </w:numPr>
+        <w:spacing w:after="0" w:line="240" w:lineRule="auto"/>
+        <w:rPr>
+          <w:rFonts w:ascii="Times New Roman" w:eastAsia="Times New Roman" w:hAnsi="Times New Roman" w:cs="Times New Roman"/>
+          <w:sz w:val="24"/>
+          <w:szCs w:val="24"/>
+        </w:rPr>
+      </w:pPr>
+      <w:r>
+        <w:rPr>
+          <w:rFonts w:ascii="Times New Roman" w:eastAsia="Times New Roman" w:hAnsi="Times New Roman" w:cs="Times New Roman"/>
+          <w:sz w:val="24"/>
+          <w:szCs w:val="24"/>
+        </w:rPr>
+        <w:t>Developed a dynamic React dashboard capable of connecting directly to any client’s database and auto-detecting modules and input fields from table structures — enabling instant CRUD (create, edit, delete, view) functionality for any new module.</w:t>
       </w:r>
     </w:p>
     <w:p>
@@ -957,42 +1087,42 @@
           <w:ilvl w:val="0"/>
           <w:numId w:val="5"/>
         </w:numPr>
-        <w:spacing w:after="280" w:line="240" w:lineRule="auto"/>
-        <w:ind w:left="1440"/>
-      </w:pPr>
-      <w:r>
-        <w:rPr>
-          <w:rFonts w:ascii="Times New Roman" w:eastAsia="Times New Roman" w:hAnsi="Times New Roman" w:cs="Times New Roman"/>
-          <w:sz w:val="24"/>
-          <w:szCs w:val="24"/>
-        </w:rPr>
-        <w:t xml:space="preserve">Built an </w:t>
-      </w:r>
-      <w:r>
-        <w:rPr>
-          <w:rFonts w:ascii="Times New Roman" w:eastAsia="Times New Roman" w:hAnsi="Times New Roman" w:cs="Times New Roman"/>
-          <w:b/>
-          <w:sz w:val="24"/>
-          <w:szCs w:val="24"/>
-        </w:rPr>
-        <w:t>admin dashboard</w:t>
-      </w:r>
-      <w:r>
-        <w:rPr>
-          <w:rFonts w:ascii="Times New Roman" w:eastAsia="Times New Roman" w:hAnsi="Times New Roman" w:cs="Times New Roman"/>
-          <w:sz w:val="24"/>
-          <w:szCs w:val="24"/>
-        </w:rPr>
-        <w:t xml:space="preserve"> for content &amp; user management, reducing support requests by </w:t>
-      </w:r>
-      <w:r>
-        <w:rPr>
-          <w:rFonts w:ascii="Times New Roman" w:eastAsia="Times New Roman" w:hAnsi="Times New Roman" w:cs="Times New Roman"/>
-          <w:b/>
-          <w:sz w:val="24"/>
-          <w:szCs w:val="24"/>
-        </w:rPr>
-        <w:t>20%</w:t>
+        <w:spacing w:after="0" w:line="240" w:lineRule="auto"/>
+        <w:ind w:left="1080"/>
+      </w:pPr>
+      <w:r>
+        <w:rPr>
+          <w:rFonts w:ascii="Times New Roman" w:eastAsia="Times New Roman" w:hAnsi="Times New Roman" w:cs="Times New Roman"/>
+          <w:sz w:val="24"/>
+          <w:szCs w:val="24"/>
+        </w:rPr>
+        <w:t xml:space="preserve">Developed </w:t>
+      </w:r>
+      <w:r>
+        <w:rPr>
+          <w:rFonts w:ascii="Times New Roman" w:eastAsia="Times New Roman" w:hAnsi="Times New Roman" w:cs="Times New Roman"/>
+          <w:b/>
+          <w:sz w:val="24"/>
+          <w:szCs w:val="24"/>
+        </w:rPr>
+        <w:t>responsive websites &amp; mobile apps</w:t>
+      </w:r>
+      <w:r>
+        <w:rPr>
+          <w:rFonts w:ascii="Times New Roman" w:eastAsia="Times New Roman" w:hAnsi="Times New Roman" w:cs="Times New Roman"/>
+          <w:sz w:val="24"/>
+          <w:szCs w:val="24"/>
+        </w:rPr>
+        <w:t xml:space="preserve"> (React, React Native) serving </w:t>
+      </w:r>
+      <w:r>
+        <w:rPr>
+          <w:rFonts w:ascii="Times New Roman" w:eastAsia="Times New Roman" w:hAnsi="Times New Roman" w:cs="Times New Roman"/>
+          <w:b/>
+          <w:sz w:val="24"/>
+          <w:szCs w:val="24"/>
+        </w:rPr>
+        <w:t>5K+ monthly active users</w:t>
       </w:r>
       <w:r>
         <w:rPr>
@@ -1009,33 +1139,50 @@
           <w:ilvl w:val="0"/>
           <w:numId w:val="5"/>
         </w:numPr>
-        <w:spacing w:before="280" w:after="0" w:line="240" w:lineRule="auto"/>
-        <w:ind w:left="1440"/>
-      </w:pPr>
-      <w:r>
-        <w:rPr>
-          <w:rFonts w:ascii="Times New Roman" w:eastAsia="Times New Roman" w:hAnsi="Times New Roman" w:cs="Times New Roman"/>
-          <w:sz w:val="24"/>
-          <w:szCs w:val="24"/>
-        </w:rPr>
-        <w:t xml:space="preserve">Engineered </w:t>
-      </w:r>
-      <w:r>
-        <w:rPr>
-          <w:rFonts w:ascii="Times New Roman" w:eastAsia="Times New Roman" w:hAnsi="Times New Roman" w:cs="Times New Roman"/>
-          <w:b/>
-          <w:sz w:val="24"/>
-          <w:szCs w:val="24"/>
-        </w:rPr>
-        <w:t>10+ API integrations</w:t>
-      </w:r>
-      <w:r>
-        <w:rPr>
-          <w:rFonts w:ascii="Times New Roman" w:eastAsia="Times New Roman" w:hAnsi="Times New Roman" w:cs="Times New Roman"/>
-          <w:sz w:val="24"/>
-          <w:szCs w:val="24"/>
-        </w:rPr>
-        <w:t>, improving system reliability and scalability.</w:t>
+        <w:spacing w:after="0" w:line="240" w:lineRule="auto"/>
+        <w:ind w:left="1080"/>
+      </w:pPr>
+      <w:r>
+        <w:rPr>
+          <w:rFonts w:ascii="Times New Roman" w:eastAsia="Times New Roman" w:hAnsi="Times New Roman" w:cs="Times New Roman"/>
+          <w:sz w:val="24"/>
+          <w:szCs w:val="24"/>
+        </w:rPr>
+        <w:t xml:space="preserve">Built an </w:t>
+      </w:r>
+      <w:r>
+        <w:rPr>
+          <w:rFonts w:ascii="Times New Roman" w:eastAsia="Times New Roman" w:hAnsi="Times New Roman" w:cs="Times New Roman"/>
+          <w:b/>
+          <w:sz w:val="24"/>
+          <w:szCs w:val="24"/>
+        </w:rPr>
+        <w:t>admin dashboard</w:t>
+      </w:r>
+      <w:r>
+        <w:rPr>
+          <w:rFonts w:ascii="Times New Roman" w:eastAsia="Times New Roman" w:hAnsi="Times New Roman" w:cs="Times New Roman"/>
+          <w:sz w:val="24"/>
+          <w:szCs w:val="24"/>
+        </w:rPr>
+        <w:t xml:space="preserve"> for content &amp; user management, reducing support requests by </w:t>
+      </w:r>
+      <w:r>
+        <w:rPr>
+          <w:rFonts w:ascii="Times New Roman" w:eastAsia="Times New Roman" w:hAnsi="Times New Roman" w:cs="Times New Roman"/>
+          <w:b/>
+          <w:sz w:val="24"/>
+          <w:szCs w:val="24"/>
+        </w:rPr>
+        <w:t>20%</w:t>
+      </w:r>
+      <w:r>
+        <w:rPr>
+          <w:rFonts w:ascii="Times New Roman" w:eastAsia="Times New Roman" w:hAnsi="Times New Roman" w:cs="Times New Roman"/>
+          <w:sz w:val="24"/>
+          <w:szCs w:val="24"/>
+        </w:rPr>
+        <w:t>.</w:t>
       </w:r>
     </w:p>
     <w:p>
@@ -1044,50 +1191,33 @@
           <w:ilvl w:val="0"/>
           <w:numId w:val="5"/>
         </w:numPr>
-        <w:spacing w:after="280" w:line="240" w:lineRule="auto"/>
-        <w:ind w:left="1440"/>
-      </w:pPr>
-      <w:r>
-        <w:rPr>
-          <w:rFonts w:ascii="Times New Roman" w:eastAsia="Times New Roman" w:hAnsi="Times New Roman" w:cs="Times New Roman"/>
-          <w:sz w:val="24"/>
-          <w:szCs w:val="24"/>
-        </w:rPr>
-        <w:t xml:space="preserve">Implemented a </w:t>
-      </w:r>
-      <w:r>
-        <w:rPr>
-          <w:rFonts w:ascii="Times New Roman" w:eastAsia="Times New Roman" w:hAnsi="Times New Roman" w:cs="Times New Roman"/>
-          <w:b/>
-          <w:sz w:val="24"/>
-          <w:szCs w:val="24"/>
-        </w:rPr>
-        <w:t>custom email system</w:t>
-      </w:r>
-      <w:r>
-        <w:rPr>
-          <w:rFonts w:ascii="Times New Roman" w:eastAsia="Times New Roman" w:hAnsi="Times New Roman" w:cs="Times New Roman"/>
-          <w:sz w:val="24"/>
-          <w:szCs w:val="24"/>
-        </w:rPr>
-        <w:t xml:space="preserve">, increasing customer engagement by </w:t>
-      </w:r>
-      <w:r>
-        <w:rPr>
-          <w:rFonts w:ascii="Times New Roman" w:eastAsia="Times New Roman" w:hAnsi="Times New Roman" w:cs="Times New Roman"/>
-          <w:b/>
-          <w:sz w:val="24"/>
-          <w:szCs w:val="24"/>
-        </w:rPr>
-        <w:t>15%</w:t>
-      </w:r>
-      <w:r>
-        <w:rPr>
-          <w:rFonts w:ascii="Times New Roman" w:eastAsia="Times New Roman" w:hAnsi="Times New Roman" w:cs="Times New Roman"/>
-          <w:sz w:val="24"/>
-          <w:szCs w:val="24"/>
-        </w:rPr>
-        <w:t>.</w:t>
+        <w:spacing w:after="0" w:line="240" w:lineRule="auto"/>
+        <w:ind w:left="1080"/>
+      </w:pPr>
+      <w:r>
+        <w:rPr>
+          <w:rFonts w:ascii="Times New Roman" w:eastAsia="Times New Roman" w:hAnsi="Times New Roman" w:cs="Times New Roman"/>
+          <w:sz w:val="24"/>
+          <w:szCs w:val="24"/>
+        </w:rPr>
+        <w:t xml:space="preserve">Engineered </w:t>
+      </w:r>
+      <w:r>
+        <w:rPr>
+          <w:rFonts w:ascii="Times New Roman" w:eastAsia="Times New Roman" w:hAnsi="Times New Roman" w:cs="Times New Roman"/>
+          <w:b/>
+          <w:sz w:val="24"/>
+          <w:szCs w:val="24"/>
+        </w:rPr>
+        <w:t>10+ API integrations</w:t>
+      </w:r>
+      <w:r>
+        <w:rPr>
+          <w:rFonts w:ascii="Times New Roman" w:eastAsia="Times New Roman" w:hAnsi="Times New Roman" w:cs="Times New Roman"/>
+          <w:sz w:val="24"/>
+          <w:szCs w:val="24"/>
+        </w:rPr>
+        <w:t>, improving system reliability and scalability.</w:t>
       </w:r>
     </w:p>
     <w:p>
@@ -1096,49 +1226,56 @@
           <w:ilvl w:val="0"/>
           <w:numId w:val="5"/>
         </w:numPr>
-        <w:spacing w:after="280" w:line="240" w:lineRule="auto"/>
-        <w:ind w:left="1440"/>
-        <w:rPr>
-          <w:rFonts w:ascii="Times New Roman" w:eastAsia="Times New Roman" w:hAnsi="Times New Roman" w:cs="Times New Roman"/>
-          <w:sz w:val="24"/>
-          <w:szCs w:val="24"/>
-        </w:rPr>
-      </w:pPr>
-      <w:r>
-        <w:rPr>
-          <w:rFonts w:ascii="Times New Roman" w:eastAsia="Times New Roman" w:hAnsi="Times New Roman" w:cs="Times New Roman"/>
-          <w:sz w:val="24"/>
-          <w:szCs w:val="24"/>
-        </w:rPr>
-        <w:t>Created an internal system (“Workspace”) that automatically generates new dashboard modules for the backend team — accelerating development speed and reducing setup time by over 60%.</w:t>
-      </w:r>
-    </w:p>
-    <w:p>
-      <w:pPr>
-        <w:numPr>
-          <w:ilvl w:val="1"/>
-          <w:numId w:val="10"/>
-        </w:numPr>
-        <w:spacing w:after="280" w:line="240" w:lineRule="auto"/>
-        <w:rPr>
-          <w:rFonts w:ascii="Times New Roman" w:eastAsia="Times New Roman" w:hAnsi="Times New Roman" w:cs="Times New Roman"/>
-          <w:sz w:val="24"/>
-          <w:szCs w:val="24"/>
-        </w:rPr>
-      </w:pPr>
-      <w:r>
-        <w:rPr>
-          <w:rFonts w:ascii="Times New Roman" w:eastAsia="Times New Roman" w:hAnsi="Times New Roman" w:cs="Times New Roman"/>
-          <w:sz w:val="24"/>
-          <w:szCs w:val="24"/>
-        </w:rPr>
-        <w:t>Developed a dynamic React dashboard capable of connecting directly to any client’s database and auto-detecting modules and input fields from table structures — enabling instant CRUD (create, edit, delete, view) functionality for any new module.</w:t>
-      </w:r>
-    </w:p>
-    <w:p>
-      <w:pPr>
-        <w:spacing w:before="280" w:after="280" w:line="240" w:lineRule="auto"/>
-        <w:ind w:left="720"/>
+        <w:spacing w:after="80" w:line="240" w:lineRule="auto"/>
+        <w:ind w:left="1080"/>
+      </w:pPr>
+      <w:r>
+        <w:rPr>
+          <w:rFonts w:ascii="Times New Roman" w:eastAsia="Times New Roman" w:hAnsi="Times New Roman" w:cs="Times New Roman"/>
+          <w:sz w:val="24"/>
+          <w:szCs w:val="24"/>
+        </w:rPr>
+        <w:t xml:space="preserve">Implemented a </w:t>
+      </w:r>
+      <w:r>
+        <w:rPr>
+          <w:rFonts w:ascii="Times New Roman" w:eastAsia="Times New Roman" w:hAnsi="Times New Roman" w:cs="Times New Roman"/>
+          <w:b/>
+          <w:sz w:val="24"/>
+          <w:szCs w:val="24"/>
+        </w:rPr>
+        <w:t>custom email system</w:t>
+      </w:r>
+      <w:r>
+        <w:rPr>
+          <w:rFonts w:ascii="Times New Roman" w:eastAsia="Times New Roman" w:hAnsi="Times New Roman" w:cs="Times New Roman"/>
+          <w:sz w:val="24"/>
+          <w:szCs w:val="24"/>
+        </w:rPr>
+        <w:t xml:space="preserve">, increasing customer engagement by </w:t>
+      </w:r>
+      <w:r>
+        <w:rPr>
+          <w:rFonts w:ascii="Times New Roman" w:eastAsia="Times New Roman" w:hAnsi="Times New Roman" w:cs="Times New Roman"/>
+          <w:b/>
+          <w:sz w:val="24"/>
+          <w:szCs w:val="24"/>
+        </w:rPr>
+        <w:t>15%</w:t>
+      </w:r>
+      <w:r>
+        <w:rPr>
+          <w:rFonts w:ascii="Times New Roman" w:eastAsia="Times New Roman" w:hAnsi="Times New Roman" w:cs="Times New Roman"/>
+          <w:sz w:val="24"/>
+          <w:szCs w:val="24"/>
+        </w:rPr>
+        <w:t>.</w:t>
+      </w:r>
+    </w:p>
+    <w:p>
+      <w:pPr>
+        <w:spacing w:before="140" w:after="80" w:line="240" w:lineRule="auto"/>
+        <w:ind w:left="540"/>
         <w:rPr>
           <w:rFonts w:ascii="Times New Roman" w:eastAsia="Times New Roman" w:hAnsi="Times New Roman" w:cs="Times New Roman"/>
           <w:sz w:val="24"/>
@@ -1178,8 +1315,8 @@
           <w:ilvl w:val="0"/>
           <w:numId w:val="6"/>
         </w:numPr>
-        <w:spacing w:before="280" w:after="0" w:line="240" w:lineRule="auto"/>
-        <w:ind w:left="1440"/>
+        <w:spacing w:before="140" w:after="0" w:line="240" w:lineRule="auto"/>
+        <w:ind w:left="1080"/>
       </w:pPr>
       <w:r>
         <w:rPr>
@@ -1231,7 +1368,7 @@
           <w:numId w:val="6"/>
         </w:numPr>
         <w:spacing w:after="0" w:line="240" w:lineRule="auto"/>
-        <w:ind w:left="1440"/>
+        <w:ind w:left="1080"/>
       </w:pPr>
       <w:r>
         <w:rPr>
@@ -1283,7 +1420,7 @@
           <w:numId w:val="6"/>
         </w:numPr>
         <w:spacing w:after="0" w:line="240" w:lineRule="auto"/>
-        <w:ind w:left="1440"/>
+        <w:ind w:left="1080"/>
       </w:pPr>
       <w:r>
         <w:rPr>
@@ -1334,8 +1471,8 @@
           <w:ilvl w:val="0"/>
           <w:numId w:val="6"/>
         </w:numPr>
-        <w:spacing w:after="280" w:line="240" w:lineRule="auto"/>
-        <w:ind w:left="1440"/>
+        <w:spacing w:after="80" w:line="240" w:lineRule="auto"/>
+        <w:ind w:left="1080"/>
       </w:pPr>
       <w:r>
         <w:rPr>
@@ -1410,7 +1547,7 @@
           <w:right w:val="nil"/>
           <w:between w:val="nil"/>
         </w:pBdr>
-        <w:spacing w:before="280" w:after="0" w:line="240" w:lineRule="auto"/>
+        <w:spacing w:before="140" w:after="0" w:line="240" w:lineRule="auto"/>
         <w:rPr>
           <w:color w:val="000000"/>
           <w:sz w:val="24"/>
@@ -1471,14 +1608,14 @@
           <w:right w:val="nil"/>
           <w:between w:val="nil"/>
         </w:pBdr>
-        <w:spacing w:before="280" w:after="0" w:line="240" w:lineRule="auto"/>
-        <w:rPr>
-          <w:color w:val="000000"/>
-          <w:sz w:val="24"/>
-          <w:szCs w:val="24"/>
-        </w:rPr>
-      </w:pPr>
-      <w:hyperlink r:id="rId11">
+        <w:spacing w:before="140" w:after="0" w:line="240" w:lineRule="auto"/>
+        <w:rPr>
+          <w:color w:val="000000"/>
+          <w:sz w:val="24"/>
+          <w:szCs w:val="24"/>
+        </w:rPr>
+      </w:pPr>
+      <w:hyperlink r:id="rId18">
         <w:r>
           <w:rPr>
             <w:rFonts w:ascii="Times New Roman" w:eastAsia="Times New Roman" w:hAnsi="Times New Roman" w:cs="Times New Roman"/>
@@ -1518,15 +1655,6 @@
         </w:rPr>
         <w:t>Played a key role in developing and optimizing both backend and frontend components, contributing to the platform’s growth and competitiveness in the Oman market.</w:t>
       </w:r>
-      <w:r>
-        <w:rPr>
-          <w:rFonts w:ascii="Times New Roman" w:eastAsia="Times New Roman" w:hAnsi="Times New Roman" w:cs="Times New Roman"/>
-          <w:color w:val="000000"/>
-          <w:sz w:val="24"/>
-          <w:szCs w:val="24"/>
-        </w:rPr>
-        <w:t>Full-stack contribution to backend &amp; frontend, improving competitive presence in Saudi market.</w:t>
-      </w:r>
     </w:p>
     <w:p>
       <w:pPr>
@@ -1541,7 +1669,7 @@
           <w:right w:val="nil"/>
           <w:between w:val="nil"/>
         </w:pBdr>
-        <w:spacing w:before="280" w:after="0" w:line="240" w:lineRule="auto"/>
+        <w:spacing w:before="140" w:after="0" w:line="240" w:lineRule="auto"/>
         <w:rPr>
           <w:color w:val="000000"/>
           <w:sz w:val="24"/>
@@ -1625,7 +1753,7 @@
           <w:right w:val="nil"/>
           <w:between w:val="nil"/>
         </w:pBdr>
-        <w:spacing w:after="280" w:line="240" w:lineRule="auto"/>
+        <w:spacing w:after="80" w:line="240" w:lineRule="auto"/>
         <w:rPr>
           <w:color w:val="000000"/>
           <w:sz w:val="24"/>
@@ -1712,7 +1840,7 @@
           <w:sz w:val="24"/>
           <w:szCs w:val="24"/>
         </w:rPr>
-        <w:t>(admin@gmail.co</w:t>
+        <w:t>(login available on request)</w:t>
       </w:r>
       <w:bookmarkStart w:id="1" w:name="_GoBack"/>
       <w:bookmarkEnd w:id="1"/>
@@ -1724,7 +1852,7 @@
           <w:sz w:val="24"/>
           <w:szCs w:val="24"/>
         </w:rPr>
-        <w:t>m | 123456789)</w:t>
+        <w:t/>
       </w:r>
       <w:r>
         <w:rPr>
@@ -1749,7 +1877,7 @@
           <w:right w:val="nil"/>
           <w:between w:val="nil"/>
         </w:pBdr>
-        <w:spacing w:after="280" w:line="240" w:lineRule="auto"/>
+        <w:spacing w:after="80" w:line="240" w:lineRule="auto"/>
         <w:rPr>
           <w:color w:val="000000"/>
           <w:sz w:val="24"/>
@@ -1797,7 +1925,7 @@
           <w:sz w:val="24"/>
           <w:szCs w:val="24"/>
         </w:rPr>
-        <w:t>(admin@gmail.com | 123456789)</w:t>
+        <w:t>(login available on request)</w:t>
       </w:r>
       <w:r>
         <w:rPr>
@@ -1837,7 +1965,7 @@
           <w:between w:val="nil"/>
         </w:pBdr>
         <w:spacing w:line="240" w:lineRule="auto"/>
-        <w:ind w:left="720"/>
+        <w:ind w:left="540"/>
         <w:rPr>
           <w:rFonts w:ascii="Times New Roman" w:eastAsia="Times New Roman" w:hAnsi="Times New Roman" w:cs="Times New Roman"/>
           <w:color w:val="000000"/>
@@ -1908,7 +2036,7 @@
           <w:sz w:val="24"/>
           <w:szCs w:val="24"/>
         </w:rPr>
-        <w:t>Sept 2017 – June 2021</w:t>
+        <w:t>Sep 2017 – Jun 2021</w:t>
       </w:r>
     </w:p>
     <w:p>
@@ -1921,7 +2049,7 @@
           <w:between w:val="nil"/>
         </w:pBdr>
         <w:spacing w:line="240" w:lineRule="auto"/>
-        <w:ind w:left="720"/>
+        <w:ind w:left="540"/>
         <w:rPr>
           <w:rFonts w:ascii="Times New Roman" w:eastAsia="Times New Roman" w:hAnsi="Times New Roman" w:cs="Times New Roman"/>
           <w:color w:val="000000"/>
@@ -1970,7 +2098,7 @@
     </w:p>
     <w:sectPr>
       <w:pgSz w:w="12240" w:h="16340"/>
-      <w:pgMar w:top="0" w:right="270" w:bottom="450" w:left="540" w:header="720" w:footer="720" w:gutter="0"/>
+      <w:pgMar w:top="360" w:right="270" w:bottom="450" w:left="540" w:header="720" w:footer="720" w:gutter="0"/>
       <w:pgNumType w:start="1"/>
       <w:cols w:space="720"/>
     </w:sectPr>

</xml_diff>

<commit_message>
CV: add Docker and GitHub Actions CI/CD under a new DevOps & CI/CD skills group
</commit_message>
<xml_diff>
--- a/public/cvs/BoulaNessimResume.docx
+++ b/public/cvs/BoulaNessimResume.docx
@@ -464,6 +464,44 @@
           <w:szCs w:val="24"/>
         </w:rPr>
         <w:t xml:space="preserve">Git (Version Control), Postman, Apache, Server Management</w:t>
+      </w:r>
+    </w:p>
+    <w:p>
+      <w:pPr>
+        <w:spacing w:before="140" w:after="80" w:line="240" w:lineRule="auto"/>
+        <w:ind w:left="540"/>
+        <w:rPr>
+          <w:rFonts w:ascii="Times New Roman" w:eastAsia="Times New Roman" w:hAnsi="Times New Roman" w:cs="Times New Roman"/>
+          <w:sz w:val="24"/>
+          <w:szCs w:val="24"/>
+        </w:rPr>
+      </w:pPr>
+      <w:r>
+        <w:rPr>
+          <w:rFonts w:ascii="Times New Roman" w:eastAsia="Times New Roman" w:hAnsi="Times New Roman" w:cs="Times New Roman"/>
+          <w:b/>
+          <w:sz w:val="24"/>
+          <w:szCs w:val="24"/>
+        </w:rPr>
+        <w:t>DevOps &amp; CI/CD</w:t>
+      </w:r>
+    </w:p>
+    <w:p>
+      <w:pPr>
+        <w:numPr>
+          <w:ilvl w:val="0"/>
+          <w:numId w:val="3"/>
+        </w:numPr>
+        <w:spacing w:before="140" w:after="80" w:line="240" w:lineRule="auto"/>
+        <w:ind w:left="1080"/>
+      </w:pPr>
+      <w:r>
+        <w:rPr>
+          <w:rFonts w:ascii="Times New Roman" w:eastAsia="Times New Roman" w:hAnsi="Times New Roman" w:cs="Times New Roman"/>
+          <w:sz w:val="24"/>
+          <w:szCs w:val="24"/>
+        </w:rPr>
+        <w:t xml:space="preserve">Docker (containerized development &amp; deployment), CI/CD with GitHub Actions (automated testing, build &amp; deployment pipelines)</w:t>
       </w:r>
     </w:p>
     <w:p>

</xml_diff>